<commit_message>
chore: sync local updates across services
</commit_message>
<xml_diff>
--- a/ai/rag/data/bany_developer_profile.docx
+++ b/ai/rag/data/bany_developer_profile.docx
@@ -8,12 +8,30 @@
         <w:jc w:val="center"/>
       </w:pPr>
       <w:r>
-        <w:t>ملف تعريفي عن شركة بانٍ للتطوير العقاري (Bany Developer)</w:t>
+        <w:t>ملف تعريفي عن شركة لبنداريٍ للتطوير العقاري (</w:t>
+      </w:r>
+      <w:r>
+        <w:t>Elbendary</w:t>
+      </w:r>
+      <w:r>
+        <w:t xml:space="preserve"> Developer)</w:t>
       </w:r>
     </w:p>
     <w:p>
       <w:r>
-        <w:t>شركة بانٍ للتطوير العقاري تُعد واحدة من أكبر وأقوى الشركات العقارية في مصر، وهي شركة تمتلك رؤية واضحة تقوم على الابتكار، الجودة، والالتزام في تقديم مجتمعات سكنية متكاملة ترتقي بمستوى حياة العملاء. على مدار سنوات طويلة، تمكنت بانٍ للتطوير العقاري من بناء اسم قوي في السوق العقاري المصري، مستندة في ذلك على مصداقيتها، خططها الاستراتيجية، وقوة مشروعاتها الممتدة في مختلف المحافظات.</w:t>
+        <w:t xml:space="preserve">شركة </w:t>
+      </w:r>
+      <w:r>
+        <w:t>لبنداري</w:t>
+      </w:r>
+      <w:r>
+        <w:t xml:space="preserve">ٍ للتطوير العقاري تُعد واحدة من أكبر وأقوى الشركات العقارية في مصر، وهي شركة تمتلك رؤية واضحة تقوم على الابتكار، الجودة، والالتزام في تقديم مجتمعات سكنية متكاملة ترتقي بمستوى حياة العملاء. على مدار سنوات طويلة، تمكنت </w:t>
+      </w:r>
+      <w:r>
+        <w:t>لبنداري</w:t>
+      </w:r>
+      <w:r>
+        <w:t>ٍ للتطوير العقاري من بناء اسم قوي في السوق العقاري المصري، مستندة في ذلك على مصداقيتها، خططها الاستراتيجية، وقوة مشروعاتها الممتدة في مختلف المحافظات.</w:t>
       </w:r>
     </w:p>
     <w:p>
@@ -26,7 +44,13 @@
     </w:p>
     <w:p>
       <w:r>
-        <w:t>بدأت شركة بانٍ للتطوير العقاري رحلتها في السوق المصري منذ أكثر من عشرين عامًا، وبدأت كمطور عقاري متخصص في المشروعات السكنية الصغيرة. ومع تزايد الطلب على السكن المتكامل في مصر، توسعت الشركة وبدأت في تنفيذ مشروعات أكبر وأكثر تعقيدًا من حيث التخطيط، التصميم، والبناء. هذا النمو السريع ساعدها في التحول إلى واحدة من أبرز الشركات التي تعتمد على الدراسات السوقية الدقيقة والتخطيط المستقبلي.</w:t>
+        <w:t xml:space="preserve">بدأت شركة </w:t>
+      </w:r>
+      <w:r>
+        <w:t>لبنداري</w:t>
+      </w:r>
+      <w:r>
+        <w:t>ٍ للتطوير العقاري رحلتها في السوق المصري منذ أكثر من عشرين عامًا، وبدأت كمطور عقاري متخصص في المشروعات السكنية الصغيرة. ومع تزايد الطلب على السكن المتكامل في مصر، توسعت الشركة وبدأت في تنفيذ مشروعات أكبر وأكثر تعقيدًا من حيث التخطيط، التصميم، والبناء. هذا النمو السريع ساعدها في التحول إلى واحدة من أبرز الشركات التي تعتمد على الدراسات السوقية الدقيقة والتخطيط المستقبلي.</w:t>
       </w:r>
     </w:p>
     <w:p>
@@ -44,7 +68,19 @@
     </w:p>
     <w:p>
       <w:r>
-        <w:t>تسعى بانٍ للتطوير العقاري إلى أن تكون المطور الأول في مصر والشرق الأوسط من خلال تقديم مشروعات تعتمد على الجودة، التكنولوجيا، والبنية التحتية الذكية. الشركة تؤمن بأن تطوير مجتمعات عمرانية ناجحة لا يعتمد فقط على المباني، بل يعتمد على خلق بيئة معيشية متكاملة تشمل كل التفاصيل التي يحتاجها العميل.</w:t>
+        <w:t xml:space="preserve">تسعى </w:t>
+      </w:r>
+      <w:r>
+        <w:t>لبنداري</w:t>
+      </w:r>
+      <w:r>
+        <w:t>ٍ للتطوير العقاري إلى أن تكون المطور الأول في مصر والشرق الأوسط من خلال تقديم مشروعات تعتمد على الجودة، التكنولوجيا، والبنية التحتية الذكية. الشركة تؤمن بأن تطوير مجتمعات عمرانية ناجحة لا يعتمد فقط على الم</w:t>
+      </w:r>
+      <w:r>
+        <w:t>لبنداري</w:t>
+      </w:r>
+      <w:r>
+        <w:t>ي، بل يعتمد على خلق بيئة معيشية متكاملة تشمل كل التفاصيل التي يحتاجها العميل.</w:t>
       </w:r>
     </w:p>
     <w:p>
@@ -62,7 +98,13 @@
     </w:p>
     <w:p>
       <w:r>
-        <w:t>تهدف شركة بانٍ للتطوير العقاري إلى تقديم منتجات عقارية عالية الجودة تلبي احتياجات مختلف فئات المجتمع المصري، مع ضمان أعلى مستويات الالتزام بالمواعيد والجودة، والحفاظ على علاقة طويلة الأمد مع عملائها.</w:t>
+        <w:t xml:space="preserve">تهدف شركة </w:t>
+      </w:r>
+      <w:r>
+        <w:t>لبنداري</w:t>
+      </w:r>
+      <w:r>
+        <w:t>ٍ للتطوير العقاري إلى تقديم منتجات عقارية عالية الجودة تلبي احتياجات مختلف فئات المجتمع المصري، مع ضمان أعلى مستويات الالتزام بالمواعيد والجودة، والحفاظ على علاقة طويلة الأمد مع عملائها.</w:t>
       </w:r>
     </w:p>
     <w:p>
@@ -1474,12 +1516,24 @@
     </w:p>
     <w:p>
       <w:r>
-        <w:t>تُعد شركة بانٍ للتطوير العقاري نموذجًا حقيقيًا للنجاح في السوق المصري، لما تقدمه من رؤية واضحة، تنفيذ عالي الجودة، ومشروعات تلبي طموحات العملاء. ومع استمرار الشركة في التوسع والتطوير، فهي تستعد لقيادة مستقبل التطوير العقاري في مصر خلال السنوات القادمة.</w:t>
+        <w:t xml:space="preserve">تُعد شركة </w:t>
+      </w:r>
+      <w:r>
+        <w:t>لبنداري</w:t>
+      </w:r>
+      <w:r>
+        <w:t>ٍ للتطوير العقاري نموذجًا حقيقيًا للنجاح في السوق المصري، لما تقدمه من رؤية واضحة، تنفيذ عالي الجودة، ومشروعات تلبي طموحات العملاء. ومع استمرار الشركة في التوسع والتطوير، فهي تستعد لقيادة مستقبل التطوير العقاري في مصر خلال السنوات القادمة.</w:t>
       </w:r>
     </w:p>
     <w:p>
       <w:r>
-        <w:t>من خلال التزامها بالجودة، الابتكار، والاستدامة، وعلاقاتها القوية مع العملاء والشركاء، تواصل شركة بانٍ للتطوير العقاري بناء إرث من التميز في صناعة التطوير العقاري المصري، وتساهم في تطوير مجتمعات عمرانية متكاملة ترتقي بمستوى حياة المصريين وتلبي طموحاتهم في الحصول على سكن راقٍ ومتكامل.</w:t>
+        <w:t xml:space="preserve">من خلال التزامها بالجودة، الابتكار، والاستدامة، وعلاقاتها القوية مع العملاء والشركاء، تواصل شركة </w:t>
+      </w:r>
+      <w:r>
+        <w:t>لبنداري</w:t>
+      </w:r>
+      <w:r>
+        <w:t>ٍ للتطوير العقاري بناء إرث من التميز في صناعة التطوير العقاري المصري، وتساهم في تطوير مجتمعات عمرانية متكاملة ترتقي بمستوى حياة المصريين وتلبي طموحاتهم في الحصول على سكن راقٍ ومتكامل.</w:t>
       </w:r>
     </w:p>
     <w:sectPr>

</xml_diff>